<commit_message>
Updated report based on duplicate analysis results
</commit_message>
<xml_diff>
--- a/Report.docx
+++ b/Report.docx
@@ -58,12 +58,44 @@
     </w:p>
     <w:p>
       <w:r>
-        <w:t>The dataset used in the project contained 11,054 observations and 32 columns, including a binary target variable representing phishing and legitimate websites. The original notebook applied several preprocessing techniques, including duplicate removal, outlier analysis, feature selection, scaling, and SMOTE oversampling. Multiple machine learning models were then trained and evaluated, including Logistic Regression, K-Nearest Neighbors, Naive Bayes, Decision Trees, Random Forests, Support Vector Machines, Multi-Layer Perceptrons, and Gradient Boosting.</w:t>
-      </w:r>
-    </w:p>
-    <w:p>
-      <w:r>
-        <w:t>The reproduction process confirmed that the dataset contains highly informative features for phishing detection. Correlation analysis revealed that variables such as HTTPS, AnchorURL, and WebsiteTraffic exhibited strong relationships with the target variable and were among the most important predictors. The reproduced experiments also confirmed the author's primary conclusion that Gradient Boosting achieved the best overall performance among the evaluated models.</w:t>
+        <w:t xml:space="preserve">The dataset used in the project contained 11,054 observations and 32 columns, including a binary target variable representing phishing and legitimate websites. The original notebook applied several preprocessing techniques, including duplicate removal, outlier analysis, feature selection, scaling, and SMOTE oversampling. Multiple machine learning models were then trained and evaluated, including Logistic Regression, K-Nearest </w:t>
+      </w:r>
+      <w:proofErr w:type="spellStart"/>
+      <w:r>
+        <w:t>Neighbors</w:t>
+      </w:r>
+      <w:proofErr w:type="spellEnd"/>
+      <w:r>
+        <w:t xml:space="preserve">, Naive Bayes, Decision Trees, Random Forests, Support Vector Machines, Multi-Layer </w:t>
+      </w:r>
+      <w:proofErr w:type="spellStart"/>
+      <w:r>
+        <w:t>Perceptrons</w:t>
+      </w:r>
+      <w:proofErr w:type="spellEnd"/>
+      <w:r>
+        <w:t>, and Gradient Boosting.</w:t>
+      </w:r>
+    </w:p>
+    <w:p>
+      <w:r>
+        <w:t xml:space="preserve">The reproduction process confirmed that the dataset contains highly informative features for phishing detection. Correlation analysis revealed that variables such as HTTPS, </w:t>
+      </w:r>
+      <w:proofErr w:type="spellStart"/>
+      <w:r>
+        <w:t>AnchorURL</w:t>
+      </w:r>
+      <w:proofErr w:type="spellEnd"/>
+      <w:r>
+        <w:t xml:space="preserve">, and </w:t>
+      </w:r>
+      <w:proofErr w:type="spellStart"/>
+      <w:r>
+        <w:t>WebsiteTraffic</w:t>
+      </w:r>
+      <w:proofErr w:type="spellEnd"/>
+      <w:r>
+        <w:t xml:space="preserve"> exhibited strong relationships with the target variable and were among the most important predictors. The reproduced experiments also confirmed the author's primary conclusion that Gradient Boosting achieved the best overall performance among the evaluated models.</w:t>
       </w:r>
     </w:p>
     <w:p>
@@ -334,12 +366,36 @@
     </w:p>
     <w:p>
       <w:r>
-        <w:t>The original project evaluates multiple machine learning algorithms, including Logistic Regression, K-Nearest Neighbors, Naive Bayes, Decision Trees, Random Forests, Support Vector Machines, Multi-Layer Perceptrons, and Gradient Boosting. According to the author, Gradient Boosting achieved the highest performance with an accuracy of approximately 94.5%.</w:t>
-      </w:r>
-    </w:p>
-    <w:p>
-      <w:r>
-        <w:t>The objective of this report is not only to reproduce the author's results, but also to examine the quality of the dataset, evaluate the preprocessing and modeling decisions, verify the reported findings, identify potential reproducibility issues, and assess whether the author's conclusions are supported by the experimental evidence.</w:t>
+        <w:t xml:space="preserve">The original project evaluates multiple machine learning algorithms, including Logistic Regression, K-Nearest </w:t>
+      </w:r>
+      <w:proofErr w:type="spellStart"/>
+      <w:r>
+        <w:t>Neighbors</w:t>
+      </w:r>
+      <w:proofErr w:type="spellEnd"/>
+      <w:r>
+        <w:t xml:space="preserve">, Naive Bayes, Decision Trees, Random Forests, Support Vector Machines, Multi-Layer </w:t>
+      </w:r>
+      <w:proofErr w:type="spellStart"/>
+      <w:r>
+        <w:t>Perceptrons</w:t>
+      </w:r>
+      <w:proofErr w:type="spellEnd"/>
+      <w:r>
+        <w:t>, and Gradient Boosting. According to the author, Gradient Boosting achieved the highest performance with an accuracy of approximately 94.5%.</w:t>
+      </w:r>
+    </w:p>
+    <w:p>
+      <w:r>
+        <w:t xml:space="preserve">The objective of this report is not only to reproduce the author's results, but also to examine the quality of the dataset, evaluate the preprocessing and </w:t>
+      </w:r>
+      <w:proofErr w:type="spellStart"/>
+      <w:r>
+        <w:t>modeling</w:t>
+      </w:r>
+      <w:proofErr w:type="spellEnd"/>
+      <w:r>
+        <w:t xml:space="preserve"> decisions, verify the reported findings, identify potential reproducibility issues, and assess whether the author's conclusions are supported by the experimental evidence.</w:t>
       </w:r>
     </w:p>
     <w:p/>
@@ -402,9 +458,11 @@
           <w:numId w:val="30"/>
         </w:numPr>
       </w:pPr>
+      <w:proofErr w:type="spellStart"/>
       <w:r>
         <w:t>UsingIP</w:t>
       </w:r>
+      <w:proofErr w:type="spellEnd"/>
     </w:p>
     <w:p>
       <w:pPr>
@@ -413,9 +471,11 @@
           <w:numId w:val="30"/>
         </w:numPr>
       </w:pPr>
+      <w:proofErr w:type="spellStart"/>
       <w:r>
         <w:t>LongURL</w:t>
       </w:r>
+      <w:proofErr w:type="spellEnd"/>
     </w:p>
     <w:p>
       <w:pPr>
@@ -457,9 +517,11 @@
           <w:numId w:val="30"/>
         </w:numPr>
       </w:pPr>
+      <w:proofErr w:type="spellStart"/>
       <w:r>
         <w:t>AnchorURL</w:t>
       </w:r>
+      <w:proofErr w:type="spellEnd"/>
     </w:p>
     <w:p>
       <w:pPr>
@@ -468,9 +530,11 @@
           <w:numId w:val="30"/>
         </w:numPr>
       </w:pPr>
+      <w:proofErr w:type="spellStart"/>
       <w:r>
         <w:t>WebsiteTraffic</w:t>
       </w:r>
+      <w:proofErr w:type="spellEnd"/>
     </w:p>
     <w:p>
       <w:pPr>
@@ -479,9 +543,11 @@
           <w:numId w:val="30"/>
         </w:numPr>
       </w:pPr>
+      <w:proofErr w:type="spellStart"/>
       <w:r>
         <w:t>GoogleIndex</w:t>
       </w:r>
+      <w:proofErr w:type="spellEnd"/>
     </w:p>
     <w:p>
       <w:pPr>
@@ -490,9 +556,11 @@
           <w:numId w:val="30"/>
         </w:numPr>
       </w:pPr>
+      <w:proofErr w:type="spellStart"/>
       <w:r>
         <w:t>StatsReport</w:t>
       </w:r>
+      <w:proofErr w:type="spellEnd"/>
     </w:p>
     <w:p>
       <w:r>
@@ -578,15 +646,19 @@
     </w:p>
     <w:p>
       <w:r>
-        <w:t>The original notebook reported that duplicate records were detected and removed before model training. Reproducing this step confirmed the author's finding. The dataset initially contained 11,054 observations. After applying drop_duplicates(), the dataset size decreased to 5,849 observations, indicating that 5,205 duplicate rows were present.</w:t>
-      </w:r>
-    </w:p>
-    <w:p>
-      <w:r>
-        <w:t>This result confirms that duplicate removal was an important preprocessing step in the original workflow and significantly reduced the dataset size before model training.</w:t>
-      </w:r>
-    </w:p>
-    <w:p/>
+        <w:t>The original notebook reported that duplicate records were detected and removed before model training. Reproducing this step confirmed the author's finding.</w:t>
+      </w:r>
+    </w:p>
+    <w:p>
+      <w:r>
+        <w:t>The dataset initially contained 11,054 observations. After applying duplicate removal, the dataset size decreased to 5,849 observations, indicating that 5,205 duplicate rows were present.</w:t>
+      </w:r>
+    </w:p>
+    <w:p>
+      <w:r>
+        <w:t>This result confirms that duplicate removal was an important preprocessing step in the original workflow and significantly reduced the dataset size before model training. Because nearly half of the observations were duplicates, removing them helps reduce potential bias and prevents certain records from exerting disproportionate influence on model training and evaluation.</w:t>
+      </w:r>
+    </w:p>
     <w:p>
       <w:pPr>
         <w:rPr>
@@ -604,7 +676,7 @@
     </w:p>
     <w:p>
       <w:r>
-        <w:t>The target variable consists of two classes:</w:t>
+        <w:t>After duplicate removal, the target variable consisted of the following classes:</w:t>
       </w:r>
     </w:p>
     <w:tbl>
@@ -714,7 +786,7 @@
               <w:t xml:space="preserve">    </w:t>
             </w:r>
             <w:r>
-              <w:t>6,157</w:t>
+              <w:t>2,830</w:t>
             </w:r>
           </w:p>
         </w:tc>
@@ -746,7 +818,7 @@
               <w:t xml:space="preserve">    </w:t>
             </w:r>
             <w:r>
-              <w:t>4,897</w:t>
+              <w:t>3,019</w:t>
             </w:r>
           </w:p>
         </w:tc>
@@ -765,7 +837,10 @@
         </w:numPr>
       </w:pPr>
       <w:r>
-        <w:t xml:space="preserve">55.7% </w:t>
+        <w:t>48.4</w:t>
+      </w:r>
+      <w:r>
+        <w:t xml:space="preserve">% </w:t>
       </w:r>
       <w:r>
         <w:t>legitimate websites</w:t>
@@ -779,7 +854,10 @@
         </w:numPr>
       </w:pPr>
       <w:r>
-        <w:t xml:space="preserve">44.3% </w:t>
+        <w:t>51.6</w:t>
+      </w:r>
+      <w:r>
+        <w:t xml:space="preserve">% </w:t>
       </w:r>
       <w:r>
         <w:t>phishing websites</w:t>
@@ -787,24 +865,13 @@
     </w:p>
     <w:p>
       <w:r>
-        <w:t>Although the original notebook describes the dataset as imbalanced, the observed class distribution indicates only a moderate imbalance</w:t>
-      </w:r>
-      <w:r>
-        <w:t>.</w:t>
-      </w:r>
-    </w:p>
-    <w:p>
-      <w:r>
-        <w:t>This finding is important because the author later applies SMOTE (Synthetic Minority Oversampling Technique) to balance the training data. Given the relatively small difference between the two classes, the impact of SMOTE on model performance deserves further examination and will be discussed later in this report.</w:t>
-      </w:r>
-    </w:p>
-    <w:p>
-      <w:pPr>
-        <w:rPr>
-          <w:b/>
-          <w:bCs/>
-        </w:rPr>
-      </w:pPr>
+        <w:t>The class distribution is nearly balanced, with only a small difference between the two classes. This finding is important because the original notebook later applies SMOTE (Synthetic Minority Oversampling Technique) to balance the training data.</w:t>
+      </w:r>
+    </w:p>
+    <w:p>
+      <w:r>
+        <w:t>Given the relatively minor imbalance, the necessity and impact of SMOTE deserve further examination and will be discussed later in this report.</w:t>
+      </w:r>
     </w:p>
     <w:p>
       <w:pPr>
@@ -853,9 +920,11 @@
           <w:numId w:val="5"/>
         </w:numPr>
       </w:pPr>
+      <w:proofErr w:type="spellStart"/>
       <w:r>
         <w:t>UsingIP</w:t>
       </w:r>
+      <w:proofErr w:type="spellEnd"/>
     </w:p>
     <w:p>
       <w:pPr>
@@ -875,9 +944,11 @@
           <w:numId w:val="5"/>
         </w:numPr>
       </w:pPr>
+      <w:proofErr w:type="spellStart"/>
       <w:r>
         <w:t>AnchorURL</w:t>
       </w:r>
+      <w:proofErr w:type="spellEnd"/>
     </w:p>
     <w:p>
       <w:pPr>
@@ -886,9 +957,11 @@
           <w:numId w:val="5"/>
         </w:numPr>
       </w:pPr>
+      <w:proofErr w:type="spellStart"/>
       <w:r>
         <w:t>GoogleIndex</w:t>
       </w:r>
+      <w:proofErr w:type="spellEnd"/>
     </w:p>
     <w:p>
       <w:pPr>
@@ -897,9 +970,11 @@
           <w:numId w:val="5"/>
         </w:numPr>
       </w:pPr>
+      <w:proofErr w:type="spellStart"/>
       <w:r>
         <w:t>WebsiteTraffic</w:t>
       </w:r>
+      <w:proofErr w:type="spellEnd"/>
     </w:p>
     <w:p>
       <w:pPr>
@@ -908,9 +983,11 @@
           <w:numId w:val="5"/>
         </w:numPr>
       </w:pPr>
+      <w:proofErr w:type="spellStart"/>
       <w:r>
         <w:t>StatsReport</w:t>
       </w:r>
+      <w:proofErr w:type="spellEnd"/>
     </w:p>
     <w:p>
       <w:r>
@@ -919,7 +996,15 @@
     </w:p>
     <w:p>
       <w:r>
-        <w:t>An important observation is that most features are already preprocessed and transformed into security indicators rather than raw website attributes. Therefore, this project focuses primarily on classification rather than feature extraction.</w:t>
+        <w:t xml:space="preserve">An important observation is that most features are already </w:t>
+      </w:r>
+      <w:proofErr w:type="spellStart"/>
+      <w:r>
+        <w:t>preprocessed</w:t>
+      </w:r>
+      <w:proofErr w:type="spellEnd"/>
+      <w:r>
+        <w:t xml:space="preserve"> and transformed into security indicators rather than raw website attributes. Therefore, this project focuses primarily on classification rather than feature extraction.</w:t>
       </w:r>
     </w:p>
     <w:p>
@@ -1255,35 +1340,6 @@
           </w:tcPr>
           <w:p>
             <w:r>
-              <w:t>0.715</w:t>
-            </w:r>
-          </w:p>
-        </w:tc>
-      </w:tr>
-      <w:tr>
-        <w:trPr>
-          <w:tblCellSpacing w:w="15" w:type="dxa"/>
-        </w:trPr>
-        <w:tc>
-          <w:tcPr>
-            <w:tcW w:w="0" w:type="auto"/>
-            <w:vAlign w:val="center"/>
-            <w:hideMark/>
-          </w:tcPr>
-          <w:p>
-            <w:r>
-              <w:t>AnchorURL</w:t>
-            </w:r>
-          </w:p>
-        </w:tc>
-        <w:tc>
-          <w:tcPr>
-            <w:tcW w:w="0" w:type="auto"/>
-            <w:vAlign w:val="center"/>
-            <w:hideMark/>
-          </w:tcPr>
-          <w:p>
-            <w:r>
               <w:t>0.693</w:t>
             </w:r>
           </w:p>
@@ -1300,9 +1356,11 @@
             <w:hideMark/>
           </w:tcPr>
           <w:p>
+            <w:proofErr w:type="spellStart"/>
             <w:r>
-              <w:t>PrefixSuffix-</w:t>
+              <w:t>AnchorURL</w:t>
             </w:r>
+            <w:proofErr w:type="spellEnd"/>
           </w:p>
         </w:tc>
         <w:tc>
@@ -1313,7 +1371,10 @@
           </w:tcPr>
           <w:p>
             <w:r>
-              <w:t>0.349</w:t>
+              <w:t>0.6</w:t>
+            </w:r>
+            <w:r>
+              <w:t>79</w:t>
             </w:r>
           </w:p>
         </w:tc>
@@ -1329,8 +1390,13 @@
             <w:hideMark/>
           </w:tcPr>
           <w:p>
+            <w:proofErr w:type="spellStart"/>
             <w:r>
-              <w:t>WebsiteTraffic</w:t>
+              <w:t>PrefixSuffix</w:t>
+            </w:r>
+            <w:proofErr w:type="spellEnd"/>
+            <w:r>
+              <w:t>-</w:t>
             </w:r>
           </w:p>
         </w:tc>
@@ -1342,7 +1408,10 @@
           </w:tcPr>
           <w:p>
             <w:r>
-              <w:t>0.346</w:t>
+              <w:t>0.3</w:t>
+            </w:r>
+            <w:r>
+              <w:t>81</w:t>
             </w:r>
           </w:p>
         </w:tc>
@@ -1358,9 +1427,11 @@
             <w:hideMark/>
           </w:tcPr>
           <w:p>
+            <w:proofErr w:type="spellStart"/>
             <w:r>
-              <w:t>SubDomains</w:t>
+              <w:t>WebsiteTraffic</w:t>
             </w:r>
+            <w:proofErr w:type="spellEnd"/>
           </w:p>
         </w:tc>
         <w:tc>
@@ -1371,7 +1442,10 @@
           </w:tcPr>
           <w:p>
             <w:r>
-              <w:t>0.298</w:t>
+              <w:t>0.</w:t>
+            </w:r>
+            <w:r>
+              <w:t>296</w:t>
             </w:r>
           </w:p>
         </w:tc>
@@ -1387,9 +1461,11 @@
             <w:hideMark/>
           </w:tcPr>
           <w:p>
+            <w:proofErr w:type="spellStart"/>
             <w:r>
-              <w:t>RequestURL</w:t>
+              <w:t>SubDomains</w:t>
             </w:r>
+            <w:proofErr w:type="spellEnd"/>
           </w:p>
         </w:tc>
         <w:tc>
@@ -1400,7 +1476,10 @@
           </w:tcPr>
           <w:p>
             <w:r>
-              <w:t>0.253</w:t>
+              <w:t>0.2</w:t>
+            </w:r>
+            <w:r>
+              <w:t>82</w:t>
             </w:r>
           </w:p>
         </w:tc>
@@ -1416,9 +1495,11 @@
             <w:hideMark/>
           </w:tcPr>
           <w:p>
+            <w:proofErr w:type="spellStart"/>
             <w:r>
-              <w:t>LinksInScriptTags</w:t>
+              <w:t>RequestURL</w:t>
             </w:r>
+            <w:proofErr w:type="spellEnd"/>
           </w:p>
         </w:tc>
         <w:tc>
@@ -1429,7 +1510,44 @@
           </w:tcPr>
           <w:p>
             <w:r>
-              <w:t>0.248</w:t>
+              <w:t>0.2</w:t>
+            </w:r>
+            <w:r>
+              <w:t>81</w:t>
+            </w:r>
+          </w:p>
+        </w:tc>
+      </w:tr>
+      <w:tr>
+        <w:trPr>
+          <w:tblCellSpacing w:w="15" w:type="dxa"/>
+        </w:trPr>
+        <w:tc>
+          <w:tcPr>
+            <w:tcW w:w="0" w:type="auto"/>
+            <w:vAlign w:val="center"/>
+            <w:hideMark/>
+          </w:tcPr>
+          <w:p>
+            <w:proofErr w:type="spellStart"/>
+            <w:r>
+              <w:t>LinksInScriptTags</w:t>
+            </w:r>
+            <w:proofErr w:type="spellEnd"/>
+          </w:p>
+        </w:tc>
+        <w:tc>
+          <w:tcPr>
+            <w:tcW w:w="0" w:type="auto"/>
+            <w:vAlign w:val="center"/>
+            <w:hideMark/>
+          </w:tcPr>
+          <w:p>
+            <w:r>
+              <w:t>0.2</w:t>
+            </w:r>
+            <w:r>
+              <w:t>44</w:t>
             </w:r>
           </w:p>
         </w:tc>
@@ -1437,12 +1555,42 @@
     </w:tbl>
     <w:p>
       <w:r>
-        <w:t>The results support the author's conclusion that HTTPS, AnchorURL, and WebsiteTraffic are among the most influential features for phishing detection.</w:t>
-      </w:r>
-    </w:p>
-    <w:p>
-      <w:r>
-        <w:t>In particular, HTTPS and AnchorURL exhibit substantially stronger relationships with the target variable than most other features in the dataset. This suggests that the security characteristics captured by these variables play a significant role in distinguishing phishing websites from legitimate ones.</w:t>
+        <w:t xml:space="preserve">The results support the author's conclusion that HTTPS, </w:t>
+      </w:r>
+      <w:proofErr w:type="spellStart"/>
+      <w:r>
+        <w:t>AnchorURL</w:t>
+      </w:r>
+      <w:proofErr w:type="spellEnd"/>
+      <w:r>
+        <w:t xml:space="preserve">, and </w:t>
+      </w:r>
+      <w:proofErr w:type="spellStart"/>
+      <w:r>
+        <w:t>WebsiteTraffic</w:t>
+      </w:r>
+      <w:proofErr w:type="spellEnd"/>
+      <w:r>
+        <w:t xml:space="preserve"> are among the most influential features for phishing detection.</w:t>
+      </w:r>
+    </w:p>
+    <w:p>
+      <w:r>
+        <w:t xml:space="preserve">In particular, </w:t>
+      </w:r>
+      <w:r>
+        <w:t xml:space="preserve">HTTPS and </w:t>
+      </w:r>
+      <w:proofErr w:type="spellStart"/>
+      <w:r>
+        <w:t>AnchorURL</w:t>
+      </w:r>
+      <w:proofErr w:type="spellEnd"/>
+      <w:r>
+        <w:t xml:space="preserve"> exhibit substantially stronger relationships with the target variable than any other feature in the dataset.</w:t>
+      </w:r>
+      <w:r>
+        <w:t xml:space="preserve"> This suggests that the security characteristics captured by these variables play a significant role in distinguishing phishing websites from legitimate ones.</w:t>
       </w:r>
       <w:r>
         <w:br/>
@@ -1513,6 +1661,7 @@
       <w:r>
         <w:t xml:space="preserve">For example, the removed feature </w:t>
       </w:r>
+      <w:proofErr w:type="spellStart"/>
       <w:r>
         <w:rPr>
           <w:i/>
@@ -1520,6 +1669,7 @@
         </w:rPr>
         <w:t>DomainRegLen</w:t>
       </w:r>
+      <w:proofErr w:type="spellEnd"/>
       <w:r>
         <w:t xml:space="preserve"> exhibited a correlation magnitude of approximately 0.226 with the target variable, which exceeds the correlation values of several features that were retained.</w:t>
       </w:r>
@@ -1567,7 +1717,15 @@
     </w:p>
     <w:p>
       <w:r>
-        <w:t>Feature engineering plays an important role in machine learning because it transforms raw data into representations that can improve model performance. In cybersecurity applications, feature engineering is particularly important because malicious behavior is often identified through patterns embedded within network traffic, URLs, or system activity rather than through a single indicator.</w:t>
+        <w:t xml:space="preserve">Feature engineering plays an important role in machine learning because it transforms raw data into representations that can improve model performance. In cybersecurity applications, feature engineering is particularly important because malicious </w:t>
+      </w:r>
+      <w:proofErr w:type="spellStart"/>
+      <w:r>
+        <w:t>behavior</w:t>
+      </w:r>
+      <w:proofErr w:type="spellEnd"/>
+      <w:r>
+        <w:t xml:space="preserve"> is often identified through patterns embedded within network traffic, URLs, or system activity rather than through a single indicator.</w:t>
       </w:r>
     </w:p>
     <w:p>
@@ -1608,8 +1766,13 @@
           <w:numId w:val="38"/>
         </w:numPr>
       </w:pPr>
-      <w:r>
-        <w:t xml:space="preserve">LongURL </w:t>
+      <w:proofErr w:type="spellStart"/>
+      <w:r>
+        <w:t>LongURL</w:t>
+      </w:r>
+      <w:proofErr w:type="spellEnd"/>
+      <w:r>
+        <w:t xml:space="preserve"> </w:t>
       </w:r>
     </w:p>
     <w:p>
@@ -1652,8 +1815,13 @@
           <w:numId w:val="38"/>
         </w:numPr>
       </w:pPr>
-      <w:r>
-        <w:t xml:space="preserve">DomainRegLen </w:t>
+      <w:proofErr w:type="spellStart"/>
+      <w:r>
+        <w:t>DomainRegLen</w:t>
+      </w:r>
+      <w:proofErr w:type="spellEnd"/>
+      <w:r>
+        <w:t xml:space="preserve"> </w:t>
       </w:r>
     </w:p>
     <w:p>
@@ -1674,8 +1842,13 @@
           <w:numId w:val="38"/>
         </w:numPr>
       </w:pPr>
-      <w:r>
-        <w:t xml:space="preserve">UsingPopupWindow </w:t>
+      <w:proofErr w:type="spellStart"/>
+      <w:r>
+        <w:t>UsingPopupWindow</w:t>
+      </w:r>
+      <w:proofErr w:type="spellEnd"/>
+      <w:r>
+        <w:t xml:space="preserve"> </w:t>
       </w:r>
     </w:p>
     <w:p>
@@ -1685,8 +1858,13 @@
           <w:numId w:val="38"/>
         </w:numPr>
       </w:pPr>
-      <w:r>
-        <w:t xml:space="preserve">IframeRedirection </w:t>
+      <w:proofErr w:type="spellStart"/>
+      <w:r>
+        <w:t>IframeRedirection</w:t>
+      </w:r>
+      <w:proofErr w:type="spellEnd"/>
+      <w:r>
+        <w:t xml:space="preserve"> </w:t>
       </w:r>
     </w:p>
     <w:p>
@@ -1696,8 +1874,13 @@
           <w:numId w:val="38"/>
         </w:numPr>
       </w:pPr>
-      <w:r>
-        <w:t xml:space="preserve">LinksPointingToPage </w:t>
+      <w:proofErr w:type="spellStart"/>
+      <w:r>
+        <w:t>LinksPointingToPage</w:t>
+      </w:r>
+      <w:proofErr w:type="spellEnd"/>
+      <w:r>
+        <w:t xml:space="preserve"> </w:t>
       </w:r>
     </w:p>
     <w:p>
@@ -1712,7 +1895,15 @@
     </w:p>
     <w:p>
       <w:r>
-        <w:t>For example, DomainRegLen exhibited a correlation magnitude of approximately 0.226 with the target variable, which exceeded the correlation values of several retained features. This suggests that potentially useful information may have been discarded.</w:t>
+        <w:t xml:space="preserve">For example, </w:t>
+      </w:r>
+      <w:proofErr w:type="spellStart"/>
+      <w:r>
+        <w:t>DomainRegLen</w:t>
+      </w:r>
+      <w:proofErr w:type="spellEnd"/>
+      <w:r>
+        <w:t xml:space="preserve"> exhibited a correlation magnitude of approximately 0.226 with the target variable, which exceeded the correlation values of several retained features. This suggests that potentially useful information may have been discarded.</w:t>
       </w:r>
     </w:p>
     <w:p>
@@ -1803,7 +1994,15 @@
         </w:numPr>
       </w:pPr>
       <w:r>
-        <w:t xml:space="preserve">K-Nearest Neighbors (KNN) </w:t>
+        <w:t xml:space="preserve">K-Nearest </w:t>
+      </w:r>
+      <w:proofErr w:type="spellStart"/>
+      <w:r>
+        <w:t>Neighbors</w:t>
+      </w:r>
+      <w:proofErr w:type="spellEnd"/>
+      <w:r>
+        <w:t xml:space="preserve"> (KNN) </w:t>
       </w:r>
     </w:p>
     <w:p>
@@ -1825,7 +2024,15 @@
         </w:numPr>
       </w:pPr>
       <w:r>
-        <w:t xml:space="preserve">Multi-Layer Perceptrons (MLP) </w:t>
+        <w:t xml:space="preserve">Multi-Layer </w:t>
+      </w:r>
+      <w:proofErr w:type="spellStart"/>
+      <w:r>
+        <w:t>Perceptrons</w:t>
+      </w:r>
+      <w:proofErr w:type="spellEnd"/>
+      <w:r>
+        <w:t xml:space="preserve"> (MLP) </w:t>
       </w:r>
     </w:p>
     <w:p>
@@ -2149,8 +2356,21 @@
       </w:r>
     </w:p>
     <w:p>
-      <w:r>
-        <w:t>df = pd.read_csv("C:\\Users\\SUMANJALI\\URL-Based Phishing Detection Using Machine Learning\\phishing.csv")</w:t>
+      <w:proofErr w:type="spellStart"/>
+      <w:r>
+        <w:t>df</w:t>
+      </w:r>
+      <w:proofErr w:type="spellEnd"/>
+      <w:r>
+        <w:t xml:space="preserve"> = </w:t>
+      </w:r>
+      <w:proofErr w:type="spellStart"/>
+      <w:r>
+        <w:t>pd.read_csv</w:t>
+      </w:r>
+      <w:proofErr w:type="spellEnd"/>
+      <w:r>
+        <w:t>("C:\\Users\\SUMANJALI\\URL-Based Phishing Detection Using Machine Learning\\phishing.csv")</w:t>
       </w:r>
     </w:p>
     <w:p>
@@ -2164,8 +2384,21 @@
       </w:r>
     </w:p>
     <w:p>
-      <w:r>
-        <w:t>df = pd.read_csv("phishing.csv")</w:t>
+      <w:proofErr w:type="spellStart"/>
+      <w:r>
+        <w:t>df</w:t>
+      </w:r>
+      <w:proofErr w:type="spellEnd"/>
+      <w:r>
+        <w:t xml:space="preserve"> = </w:t>
+      </w:r>
+      <w:proofErr w:type="spellStart"/>
+      <w:r>
+        <w:t>pd.read_csv</w:t>
+      </w:r>
+      <w:proofErr w:type="spellEnd"/>
+      <w:r>
+        <w:t>("phishing.csv")</w:t>
       </w:r>
     </w:p>
     <w:p>
@@ -2174,8 +2407,21 @@
       </w:r>
     </w:p>
     <w:p>
-      <w:r>
-        <w:t>df = pd.read_csv("./data/phishing.csv")</w:t>
+      <w:proofErr w:type="spellStart"/>
+      <w:r>
+        <w:t>df</w:t>
+      </w:r>
+      <w:proofErr w:type="spellEnd"/>
+      <w:r>
+        <w:t xml:space="preserve"> = </w:t>
+      </w:r>
+      <w:proofErr w:type="spellStart"/>
+      <w:r>
+        <w:t>pd.read_csv</w:t>
+      </w:r>
+      <w:proofErr w:type="spellEnd"/>
+      <w:r>
+        <w:t>("./data/phishing.csv")</w:t>
       </w:r>
     </w:p>
     <w:p>
@@ -2462,12 +2708,28 @@
     </w:p>
     <w:p>
       <w:r>
-        <w:t>Several machine learning algorithms used in the notebook contain stochastic components, including Decision Trees, Random Forests, and Multi-Layer Perceptrons.</w:t>
-      </w:r>
-    </w:p>
-    <w:p>
-      <w:r>
-        <w:t>However, the notebook does not consistently specify a random_state parameter when initializing these models.</w:t>
+        <w:t xml:space="preserve">Several machine learning algorithms used in the notebook contain stochastic components, including Decision Trees, Random Forests, and Multi-Layer </w:t>
+      </w:r>
+      <w:proofErr w:type="spellStart"/>
+      <w:r>
+        <w:t>Perceptrons</w:t>
+      </w:r>
+      <w:proofErr w:type="spellEnd"/>
+      <w:r>
+        <w:t>.</w:t>
+      </w:r>
+    </w:p>
+    <w:p>
+      <w:r>
+        <w:t xml:space="preserve">However, the notebook does not consistently specify a </w:t>
+      </w:r>
+      <w:proofErr w:type="spellStart"/>
+      <w:r>
+        <w:t>random_state</w:t>
+      </w:r>
+      <w:proofErr w:type="spellEnd"/>
+      <w:r>
+        <w:t xml:space="preserve"> parameter when initializing these models.</w:t>
       </w:r>
     </w:p>
     <w:p>
@@ -2736,8 +2998,13 @@
       </w:r>
     </w:p>
     <w:p>
-      <w:r>
-        <w:t>random_state = 42</w:t>
+      <w:proofErr w:type="spellStart"/>
+      <w:r>
+        <w:t>random_state</w:t>
+      </w:r>
+      <w:proofErr w:type="spellEnd"/>
+      <w:r>
+        <w:t xml:space="preserve"> = 42</w:t>
       </w:r>
     </w:p>
     <w:p>
@@ -3410,12 +3677,21 @@
       <w:r>
         <w:t xml:space="preserve">For example, the feature </w:t>
       </w:r>
+      <w:proofErr w:type="spellStart"/>
       <w:r>
         <w:rPr>
           <w:i/>
           <w:iCs/>
         </w:rPr>
-        <w:t xml:space="preserve">DomainRegLen </w:t>
+        <w:t>DomainRegLen</w:t>
+      </w:r>
+      <w:proofErr w:type="spellEnd"/>
+      <w:r>
+        <w:rPr>
+          <w:i/>
+          <w:iCs/>
+        </w:rPr>
+        <w:t xml:space="preserve"> </w:t>
       </w:r>
       <w:r>
         <w:t>demonstrated a stronger relationship with the target variable than several features that were retained.</w:t>
@@ -3695,9 +3971,11 @@
           <w:numId w:val="26"/>
         </w:numPr>
       </w:pPr>
+      <w:proofErr w:type="spellStart"/>
       <w:r>
         <w:t>AnchorURL</w:t>
       </w:r>
+      <w:proofErr w:type="spellEnd"/>
     </w:p>
     <w:p>
       <w:pPr>
@@ -3706,9 +3984,11 @@
           <w:numId w:val="26"/>
         </w:numPr>
       </w:pPr>
+      <w:proofErr w:type="spellStart"/>
       <w:r>
         <w:t>WebsiteTraffic</w:t>
       </w:r>
+      <w:proofErr w:type="spellEnd"/>
     </w:p>
     <w:p>
       <w:r>
@@ -3867,7 +4147,15 @@
         </w:numPr>
       </w:pPr>
       <w:r>
-        <w:t>K-Nearest Neighbors (KNN)</w:t>
+        <w:t xml:space="preserve">K-Nearest </w:t>
+      </w:r>
+      <w:proofErr w:type="spellStart"/>
+      <w:r>
+        <w:t>Neighbors</w:t>
+      </w:r>
+      <w:proofErr w:type="spellEnd"/>
+      <w:r>
+        <w:t xml:space="preserve"> (KNN)</w:t>
       </w:r>
     </w:p>
     <w:p>
@@ -4298,8 +4586,13 @@
           </w:tcPr>
           <w:p>
             <w:r>
-              <w:t>K-Nearest Neighbors</w:t>
+              <w:t xml:space="preserve">K-Nearest </w:t>
             </w:r>
+            <w:proofErr w:type="spellStart"/>
+            <w:r>
+              <w:t>Neighbors</w:t>
+            </w:r>
+            <w:proofErr w:type="spellEnd"/>
           </w:p>
         </w:tc>
         <w:tc>
@@ -4432,7 +4725,15 @@
         <w:t xml:space="preserve"> </w:t>
       </w:r>
       <w:r>
-        <w:t>Logistic Regression and K-Nearest Neighbors achieved identical accuracies of 92.22%.</w:t>
+        <w:t xml:space="preserve">Logistic Regression and K-Nearest </w:t>
+      </w:r>
+      <w:proofErr w:type="spellStart"/>
+      <w:r>
+        <w:t>Neighbors</w:t>
+      </w:r>
+      <w:proofErr w:type="spellEnd"/>
+      <w:r>
+        <w:t xml:space="preserve"> achieved identical accuracies of 92.22%.</w:t>
       </w:r>
     </w:p>
     <w:p>
@@ -4440,7 +4741,15 @@
         <w:t xml:space="preserve">The results </w:t>
       </w:r>
       <w:r>
-        <w:t>indicate that ensemble-based methods achieved the strongest performance on this dataset. Gradient Boosting and Random Forest occupied the top two positions, while simpler models such as Logistic Regression and K-Nearest Neighbors achieved slightly lower accuracy. Naive Bayes performed substantially worse than all other evaluated models.</w:t>
+        <w:t xml:space="preserve">indicate that ensemble-based methods achieved the strongest performance on this dataset. Gradient Boosting and Random Forest occupied the top two positions, while simpler models such as Logistic Regression and K-Nearest </w:t>
+      </w:r>
+      <w:proofErr w:type="spellStart"/>
+      <w:r>
+        <w:t>Neighbors</w:t>
+      </w:r>
+      <w:proofErr w:type="spellEnd"/>
+      <w:r>
+        <w:t xml:space="preserve"> achieved slightly lower accuracy. Naive Bayes performed substantially worse than all other evaluated models.</w:t>
       </w:r>
     </w:p>
     <w:p>
@@ -4565,7 +4874,15 @@
         <w:t>correctly classified all observations belonging to Class -1, it correctly identified only a small proportion of Class 1 observations.</w:t>
       </w:r>
       <w:r>
-        <w:t xml:space="preserve"> This resulted in a highly unbalanced classifier that favored one class while performing poorly on the other. The results illustrate why accuracy alone can be misleading and highlight the importance of examining precision, recall, and F1-scores alongside overall accuracy.</w:t>
+        <w:t xml:space="preserve"> This resulted in a highly unbalanced classifier that </w:t>
+      </w:r>
+      <w:proofErr w:type="spellStart"/>
+      <w:r>
+        <w:t>favored</w:t>
+      </w:r>
+      <w:proofErr w:type="spellEnd"/>
+      <w:r>
+        <w:t xml:space="preserve"> one class while performing poorly on the other. The results illustrate why accuracy alone can be misleading and highlight the importance of examining precision, recall, and F1-scores alongside overall accuracy.</w:t>
       </w:r>
     </w:p>
     <w:p>
@@ -4727,7 +5044,15 @@
     </w:p>
     <w:p>
       <w:r>
-        <w:t>The model produced 35 false positives and 29 false negatives. The relatively balanced distribution of errors suggests that the classifier did not strongly favor one class over the other.</w:t>
+        <w:t xml:space="preserve">The model produced 35 false positives and 29 false negatives. The relatively balanced distribution of errors suggests that the classifier did not strongly </w:t>
+      </w:r>
+      <w:proofErr w:type="spellStart"/>
+      <w:r>
+        <w:t>favor</w:t>
+      </w:r>
+      <w:proofErr w:type="spellEnd"/>
+      <w:r>
+        <w:t xml:space="preserve"> one class over the other.</w:t>
       </w:r>
     </w:p>
     <w:p>
@@ -4793,7 +5118,23 @@
     </w:p>
     <w:p>
       <w:r>
-        <w:t>Several strengths were identified throughout the analysis. The project uses a publicly available dataset, evaluates multiple machine learning algorithms, performs exploratory data analysis, and reports several performance metrics. The final conclusion that Gradient Boosting achieved the highest performance was supported by the reproduced results. Furthermore, the independent analysis confirmed that important features identified by the author, such as HTTPS, AnchorURL, and WebsiteTraffic, are among the strongest predictors in the dataset.</w:t>
+        <w:t xml:space="preserve">Several strengths were identified throughout the analysis. The project uses a publicly available dataset, evaluates multiple machine learning algorithms, performs exploratory data analysis, and reports several performance metrics. The final conclusion that Gradient Boosting achieved the highest performance was supported by the reproduced results. Furthermore, the independent analysis confirmed that important features identified by the author, such as HTTPS, </w:t>
+      </w:r>
+      <w:proofErr w:type="spellStart"/>
+      <w:r>
+        <w:t>AnchorURL</w:t>
+      </w:r>
+      <w:proofErr w:type="spellEnd"/>
+      <w:r>
+        <w:t xml:space="preserve">, and </w:t>
+      </w:r>
+      <w:proofErr w:type="spellStart"/>
+      <w:r>
+        <w:t>WebsiteTraffic</w:t>
+      </w:r>
+      <w:proofErr w:type="spellEnd"/>
+      <w:r>
+        <w:t>, are among the strongest predictors in the dataset.</w:t>
       </w:r>
     </w:p>
     <w:p>

</xml_diff>

<commit_message>
Finalized Gradient Boosting evaluation metrics
</commit_message>
<xml_diff>
--- a/Report.docx
+++ b/Report.docx
@@ -58,7 +58,7 @@
     </w:p>
     <w:p>
       <w:r>
-        <w:t xml:space="preserve">The dataset used in the project contained 11,054 observations and 32 columns, including a binary target variable representing phishing and legitimate websites. The original notebook applied several preprocessing techniques, including duplicate removal, outlier analysis, feature selection, scaling, and SMOTE oversampling. Multiple machine learning models were then trained and evaluated, including Logistic Regression, K-Nearest </w:t>
+        <w:t xml:space="preserve">The dataset used in the project contained 11,054 observations and 32 columns, including a binary target variable representing phishing and legitimate websites. The original notebook applied several preprocessing techniques, including duplicate removal, outlier analysis, feature selection, scaling, and SMOTE oversampling. After duplicate removal, the working dataset contained 5,849 unique observations. Multiple machine learning models were then trained and evaluated, including Logistic Regression, K-Nearest </w:t>
       </w:r>
       <w:proofErr w:type="spellStart"/>
       <w:r>
@@ -79,7 +79,7 @@
     </w:p>
     <w:p>
       <w:r>
-        <w:t xml:space="preserve">The reproduction process confirmed that the dataset contains highly informative features for phishing detection. Correlation analysis revealed that variables such as HTTPS, </w:t>
+        <w:t xml:space="preserve">The reproduction process confirmed that the dataset contains highly informative features for phishing detection. Correlation analysis revealed that HTTPS (0.693), </w:t>
       </w:r>
       <w:proofErr w:type="spellStart"/>
       <w:r>
@@ -87,7 +87,7 @@
       </w:r>
       <w:proofErr w:type="spellEnd"/>
       <w:r>
-        <w:t xml:space="preserve">, and </w:t>
+        <w:t xml:space="preserve"> (0.679), and </w:t>
       </w:r>
       <w:proofErr w:type="spellStart"/>
       <w:r>
@@ -95,27 +95,27 @@
       </w:r>
       <w:proofErr w:type="spellEnd"/>
       <w:r>
-        <w:t xml:space="preserve"> exhibited strong relationships with the target variable and were among the most important predictors. The reproduced experiments also confirmed the author's primary conclusion that Gradient Boosting achieved the best overall performance among the evaluated models.</w:t>
-      </w:r>
-    </w:p>
-    <w:p>
-      <w:r>
-        <w:t>Model evaluation showed that Gradient Boosting achieved an accuracy of approximately 94.5%, along with strong precision, recall, and F1-score values. Random Forest, Support Vector Machine, and Multi-Layer Perceptron models also achieved similar performance levels, while Naive Bayes performed significantly worse than the other algorithms. The results suggest that the selected feature set provides substantial predictive information and allows multiple machine learning models to effectively distinguish phishing websites from legitimate websites.</w:t>
-      </w:r>
-    </w:p>
-    <w:p>
-      <w:r>
-        <w:t>Although the primary findings of the project were successfully reproduced, several methodological and reproducibility concerns were identified. These included hardcoded file paths, inconsistent notebook documentation, references to unrelated projects, missing random seeds, limited justification for certain preprocessing decisions, and uncertainty regarding dataset modifications reported in the notebook. In addition, some feature-selection decisions appeared to rely primarily on correlation values without stronger supporting evidence.</w:t>
-      </w:r>
-    </w:p>
-    <w:p>
-      <w:r>
-        <w:t>The project can serve as a useful baseline for similar phishing detection problems because it achieves strong predictive performance and compares multiple machine learning algorithms. However, future implementations should improve reproducibility, documentation quality, and experimental validation before being deployed in real-world cybersecurity environments.</w:t>
-      </w:r>
-    </w:p>
-    <w:p>
-      <w:r>
-        <w:t>Overall, the project demonstrates an effective application of machine learning techniques to phishing website detection and achieves strong classification performance. The author's main claims were supported by the reproduced results. However, improvements in documentation, reproducibility practices, preprocessing justification, and experimental transparency would strengthen the reliability and scientific rigor of the work.</w:t>
+        <w:t xml:space="preserve"> (0.282) exhibited some of the strongest relationships with the target variable and were among the most important predictors. The reproduced experiments also confirmed the author's primary conclusion that Gradient Boosting achieved the best overall performance among the evaluated models. Furthermore, the reproduced model rankings were highly consistent with those reported by the author, providing additional confidence in the validity of the original findings.</w:t>
+      </w:r>
+    </w:p>
+    <w:p>
+      <w:r>
+        <w:t>Model evaluation showed that the reproduced Gradient Boosting model achieved an accuracy of 94.62%, a precision of 92.31%, a recall of 95.73%, an F1-score of 93.99%, a Matthews Correlation Coefficient (MCC) of 0.887, and a ROC-AUC score of 0.990. Random Forest, Multi-Layer Perceptron, and Support Vector Machine models achieved similar performance levels, while Naive Bayes performed significantly worse than all other evaluated algorithms. The results suggest that the selected feature set provides substantial predictive information and allows multiple machine learning models to effectively distinguish phishing websites from legitimate websites.</w:t>
+      </w:r>
+    </w:p>
+    <w:p>
+      <w:r>
+        <w:t>Although the primary findings of the project were successfully reproduced, several methodological and reproducibility concerns were identified. These included hardcoded file paths, inconsistent notebook documentation, references to unrelated projects, missing random seeds, and limited justification for certain preprocessing decisions. In addition, some feature-selection decisions appeared to rely primarily on correlation values without stronger supporting evidence.</w:t>
+      </w:r>
+    </w:p>
+    <w:p>
+      <w:r>
+        <w:t>The project can serve as a useful baseline for similar phishing detection problems because it achieves strong predictive performance and compares multiple machine learning algorithms. However, future implementations should improve reproducibility, documentation quality, feature-selection justification, and experimental validation before being deployed in real-world cybersecurity environments.</w:t>
+      </w:r>
+    </w:p>
+    <w:p>
+      <w:r>
+        <w:t>Overall, the project demonstrates an effective application of machine learning techniques to phishing website detection and achieves strong classification performance. The author's main claims were supported by the reproduced results, particularly the effectiveness of Gradient Boosting as the highest-performing model. Nevertheless, improvements in documentation, reproducibility practices, preprocessing justification, and experimental transparency would strengthen the reliability, transparency, and scientific rigor of the study.</w:t>
       </w:r>
     </w:p>
     <w:p/>

</xml_diff>

<commit_message>
Remove original notebook and add it to readme instead
</commit_message>
<xml_diff>
--- a/Report.docx
+++ b/Report.docx
@@ -19,6 +19,7 @@
       </w:r>
     </w:p>
     <w:p/>
+    <w:p/>
     <w:p>
       <w:pPr>
         <w:rPr>
@@ -50,74 +51,42 @@
           <w:i/>
           <w:iCs/>
         </w:rPr>
-        <w:t>URL-Based Phishing Detection using Machine Learning</w:t>
-      </w:r>
-      <w:r>
-        <w:t>. The objective of the original project was to classify websites as either legitimate or phishing based on a set of URL and website-related features. Phishing detection is an important cybersecurity problem because phishing websites are commonly used to steal sensitive information such as usernames, passwords, and financial data.</w:t>
-      </w:r>
-    </w:p>
-    <w:p>
-      <w:r>
-        <w:t xml:space="preserve">The dataset used in the project contained 11,054 observations and 32 columns, including a binary target variable representing phishing and legitimate websites. The original notebook applied several preprocessing techniques, including duplicate removal, outlier analysis, feature selection, scaling, and SMOTE oversampling. After duplicate removal, the working dataset contained 5,849 unique observations. Multiple machine learning models were then trained and evaluated, including Logistic Regression, K-Nearest </w:t>
-      </w:r>
-      <w:proofErr w:type="spellStart"/>
-      <w:r>
-        <w:t>Neighbors</w:t>
-      </w:r>
-      <w:proofErr w:type="spellEnd"/>
-      <w:r>
-        <w:t xml:space="preserve">, Naive Bayes, Decision Trees, Random Forests, Support Vector Machines, Multi-Layer </w:t>
-      </w:r>
-      <w:proofErr w:type="spellStart"/>
-      <w:r>
-        <w:t>Perceptrons</w:t>
-      </w:r>
-      <w:proofErr w:type="spellEnd"/>
-      <w:r>
-        <w:t>, and Gradient Boosting.</w:t>
-      </w:r>
-    </w:p>
-    <w:p>
-      <w:r>
-        <w:t xml:space="preserve">The reproduction process confirmed that the dataset contains highly informative features for phishing detection. Correlation analysis revealed that HTTPS (0.693), </w:t>
-      </w:r>
-      <w:proofErr w:type="spellStart"/>
-      <w:r>
-        <w:t>AnchorURL</w:t>
-      </w:r>
-      <w:proofErr w:type="spellEnd"/>
-      <w:r>
-        <w:t xml:space="preserve"> (0.679), and </w:t>
-      </w:r>
-      <w:proofErr w:type="spellStart"/>
-      <w:r>
-        <w:t>WebsiteTraffic</w:t>
-      </w:r>
-      <w:proofErr w:type="spellEnd"/>
-      <w:r>
-        <w:t xml:space="preserve"> (0.282) exhibited some of the strongest relationships with the target variable and were among the most important predictors. The reproduced experiments also confirmed the author's primary conclusion that Gradient Boosting achieved the best overall performance among the evaluated models. Furthermore, the reproduced model rankings were highly consistent with those reported by the author, providing additional confidence in the validity of the original findings.</w:t>
-      </w:r>
-    </w:p>
-    <w:p>
-      <w:r>
-        <w:t>Model evaluation showed that the reproduced Gradient Boosting model achieved an accuracy of 94.62%, a precision of 92.31%, a recall of 95.73%, an F1-score of 93.99%, a Matthews Correlation Coefficient (MCC) of 0.887, and a ROC-AUC score of 0.990. Random Forest, Multi-Layer Perceptron, and Support Vector Machine models achieved similar performance levels, while Naive Bayes performed significantly worse than all other evaluated algorithms. The results suggest that the selected feature set provides substantial predictive information and allows multiple machine learning models to effectively distinguish phishing websites from legitimate websites.</w:t>
-      </w:r>
-    </w:p>
-    <w:p>
-      <w:r>
-        <w:t>Although the primary findings of the project were successfully reproduced, several methodological and reproducibility concerns were identified. These included hardcoded file paths, inconsistent notebook documentation, references to unrelated projects, missing random seeds, and limited justification for certain preprocessing decisions. In addition, some feature-selection decisions appeared to rely primarily on correlation values without stronger supporting evidence.</w:t>
-      </w:r>
-    </w:p>
-    <w:p>
-      <w:r>
-        <w:t>The project can serve as a useful baseline for similar phishing detection problems because it achieves strong predictive performance and compares multiple machine learning algorithms. However, future implementations should improve reproducibility, documentation quality, feature-selection justification, and experimental validation before being deployed in real-world cybersecurity environments.</w:t>
-      </w:r>
-    </w:p>
-    <w:p>
-      <w:r>
-        <w:t>Overall, the project demonstrates an effective application of machine learning techniques to phishing website detection and achieves strong classification performance. The author's main claims were supported by the reproduced results, particularly the effectiveness of Gradient Boosting as the highest-performing model. Nevertheless, improvements in documentation, reproducibility practices, preprocessing justification, and experimental transparency would strengthen the reliability, transparency, and scientific rigor of the study.</w:t>
-      </w:r>
-    </w:p>
+        <w:t>URL-Based Phishing Detection Using Machine Learning</w:t>
+      </w:r>
+      <w:r>
+        <w:t>. The objective of the original project was to classify websites as either legitimate or phishing using URL and website-related features. Phishing detection is an important cybersecurity problem because phishing websites are frequently used to steal sensitive information such as usernames, passwords, and financial data.</w:t>
+      </w:r>
+    </w:p>
+    <w:p>
+      <w:r>
+        <w:t>The dataset contained 11,054 observations and 32 columns. After duplicate removal, the working dataset consisted of 5,849 unique observations. Multiple machine learning models were evaluated, including Logistic Regression, K-Nearest Neighbors, Naive Bayes, Decision Trees, Random Forests, Support Vector Machines, Multi-Layer Perceptrons, and Gradient Boosting.</w:t>
+      </w:r>
+    </w:p>
+    <w:p>
+      <w:r>
+        <w:t>The reproduction process confirmed that the dataset contains highly informative features for phishing detection. Correlation, crosstab, and feature importance analyses identified HTTPS, AnchorURL, and WebsiteTraffic among the most influential predictors. The reproduced experiments also confirmed the author’s primary conclusion that Gradient Boosting achieved the best overall performance.</w:t>
+      </w:r>
+    </w:p>
+    <w:p>
+      <w:r>
+        <w:t>The reproduced Gradient Boosting model achieved an accuracy of 94.62%, Precision of 93.75%, Recall of 94.62%, F1-score of 94.18%, MCC of 0.892, and ROC-AUC of 0.992. These results indicate strong discrimination between phishing and legitimate websites and demonstrate the effectiveness of the selected feature set.</w:t>
+      </w:r>
+    </w:p>
+    <w:p>
+      <w:r>
+        <w:t>Although the primary findings were successfully reproduced, several methodological concerns were identified, including hardcoded file paths, documentation inconsistencies, missing random seeds, data leakage caused by scaling before the train-test split, and limited justification for certain preprocessing decisions. An additional experiment showed that SMOTE provided only modest performance improvements, suggesting that the strong results were primarily driven by the predictive quality of the features rather than oversampling.</w:t>
+      </w:r>
+    </w:p>
+    <w:p>
+      <w:r>
+        <w:t>Overall, the project demonstrates an effective application of machine learning to phishing website detection. The author’s main conclusions were supported by the reproduced results; however, improvements in reproducibility practices, documentation quality, and methodological transparency would strengthen the reliability and scientific rigor of the work.</w:t>
+      </w:r>
+    </w:p>
+    <w:p/>
+    <w:p/>
+    <w:p/>
+    <w:p/>
+    <w:p/>
     <w:p/>
     <w:p>
       <w:pPr>
@@ -361,44 +330,28 @@
     </w:p>
     <w:p>
       <w:r>
-        <w:t>Phishing is one of the most common cybersecurity threats. Attackers create fraudulent websites that imitate trusted organizations in order to steal sensitive information such as usernames, passwords, and financial credentials. Because phishing websites often exhibit identifiable patterns, machine learning techniques can be used to automatically detect suspicious URLs before users interact with them.</w:t>
-      </w:r>
-    </w:p>
-    <w:p>
-      <w:r>
-        <w:t xml:space="preserve">The original project evaluates multiple machine learning algorithms, including Logistic Regression, K-Nearest </w:t>
-      </w:r>
-      <w:proofErr w:type="spellStart"/>
-      <w:r>
-        <w:t>Neighbors</w:t>
-      </w:r>
-      <w:proofErr w:type="spellEnd"/>
-      <w:r>
-        <w:t xml:space="preserve">, Naive Bayes, Decision Trees, Random Forests, Support Vector Machines, Multi-Layer </w:t>
-      </w:r>
-      <w:proofErr w:type="spellStart"/>
-      <w:r>
-        <w:t>Perceptrons</w:t>
-      </w:r>
-      <w:proofErr w:type="spellEnd"/>
-      <w:r>
-        <w:t xml:space="preserve">, and Gradient Boosting. According </w:t>
-      </w:r>
-      <w:r>
-        <w:t>to the author, Gradient Boosting achieved the highest performance with an accuracy of approximately 94.5%, outperforming the other evaluated machine learning models.</w:t>
-      </w:r>
-    </w:p>
-    <w:p>
-      <w:r>
-        <w:t xml:space="preserve">The objective of this report is not only to reproduce the author's results, but also to examine the quality of the dataset, evaluate the preprocessing and </w:t>
-      </w:r>
-      <w:proofErr w:type="spellStart"/>
-      <w:r>
-        <w:t>modeling</w:t>
-      </w:r>
-      <w:proofErr w:type="spellEnd"/>
-      <w:r>
-        <w:t xml:space="preserve"> decisions, verify the reported findings, identify potential reproducibility issues, and assess whether the author's conclusions are supported by the experimental evidence.</w:t>
+        <w:t xml:space="preserve">Phishing is one of the most common cybersecurity threats. Attackers create fraudulent websites that imitate trusted organizations </w:t>
+      </w:r>
+      <w:proofErr w:type="gramStart"/>
+      <w:r>
+        <w:t>in order to</w:t>
+      </w:r>
+      <w:proofErr w:type="gramEnd"/>
+      <w:r>
+        <w:t xml:space="preserve"> steal sensitive information such as usernames, passwords, and financial credentials. Because phishing websites often exhibit identifiable patterns, machine learning techniques can be used to automatically detect suspicious URLs before users interact with them.</w:t>
+      </w:r>
+    </w:p>
+    <w:p>
+      <w:r>
+        <w:t xml:space="preserve">The original project evaluates multiple machine learning algorithms, including Logistic Regression, K-Nearest Neighbors, Naive Bayes, Decision Trees, Random Forests, Support Vector Machines, Multi-Layer Perceptrons, and Gradient Boosting. </w:t>
+      </w:r>
+      <w:r>
+        <w:t>According to the author, Gradient Boosting achieved the highest performance with an accuracy of approximately 94.5%, making it the best-performing model among those evaluated.</w:t>
+      </w:r>
+    </w:p>
+    <w:p>
+      <w:r>
+        <w:t>The objective of this report is not only to reproduce the author's results, but also to examine the quality of the dataset, evaluate the preprocessing and modeling decisions, verify the reported findings, identify potential reproducibility issues, and assess whether the author's conclusions are supported by the experimental evidence.</w:t>
       </w:r>
     </w:p>
     <w:p/>
@@ -461,11 +414,9 @@
           <w:numId w:val="30"/>
         </w:numPr>
       </w:pPr>
-      <w:proofErr w:type="spellStart"/>
       <w:r>
         <w:t>UsingIP</w:t>
       </w:r>
-      <w:proofErr w:type="spellEnd"/>
     </w:p>
     <w:p>
       <w:pPr>
@@ -474,11 +425,9 @@
           <w:numId w:val="30"/>
         </w:numPr>
       </w:pPr>
-      <w:proofErr w:type="spellStart"/>
       <w:r>
         <w:t>LongURL</w:t>
       </w:r>
-      <w:proofErr w:type="spellEnd"/>
     </w:p>
     <w:p>
       <w:pPr>
@@ -520,11 +469,9 @@
           <w:numId w:val="30"/>
         </w:numPr>
       </w:pPr>
-      <w:proofErr w:type="spellStart"/>
       <w:r>
         <w:t>AnchorURL</w:t>
       </w:r>
-      <w:proofErr w:type="spellEnd"/>
     </w:p>
     <w:p>
       <w:pPr>
@@ -533,11 +480,9 @@
           <w:numId w:val="30"/>
         </w:numPr>
       </w:pPr>
-      <w:proofErr w:type="spellStart"/>
       <w:r>
         <w:t>WebsiteTraffic</w:t>
       </w:r>
-      <w:proofErr w:type="spellEnd"/>
     </w:p>
     <w:p>
       <w:pPr>
@@ -546,11 +491,9 @@
           <w:numId w:val="30"/>
         </w:numPr>
       </w:pPr>
-      <w:proofErr w:type="spellStart"/>
       <w:r>
         <w:t>GoogleIndex</w:t>
       </w:r>
-      <w:proofErr w:type="spellEnd"/>
     </w:p>
     <w:p>
       <w:pPr>
@@ -559,11 +502,9 @@
           <w:numId w:val="30"/>
         </w:numPr>
       </w:pPr>
-      <w:proofErr w:type="spellStart"/>
       <w:r>
         <w:t>StatsReport</w:t>
       </w:r>
-      <w:proofErr w:type="spellEnd"/>
     </w:p>
     <w:p>
       <w:r>
@@ -929,11 +870,9 @@
           <w:numId w:val="5"/>
         </w:numPr>
       </w:pPr>
-      <w:proofErr w:type="spellStart"/>
       <w:r>
         <w:t>UsingIP</w:t>
       </w:r>
-      <w:proofErr w:type="spellEnd"/>
     </w:p>
     <w:p>
       <w:pPr>
@@ -953,11 +892,9 @@
           <w:numId w:val="5"/>
         </w:numPr>
       </w:pPr>
-      <w:proofErr w:type="spellStart"/>
       <w:r>
         <w:t>AnchorURL</w:t>
       </w:r>
-      <w:proofErr w:type="spellEnd"/>
     </w:p>
     <w:p>
       <w:pPr>
@@ -966,11 +903,9 @@
           <w:numId w:val="5"/>
         </w:numPr>
       </w:pPr>
-      <w:proofErr w:type="spellStart"/>
       <w:r>
         <w:t>GoogleIndex</w:t>
       </w:r>
-      <w:proofErr w:type="spellEnd"/>
     </w:p>
     <w:p>
       <w:pPr>
@@ -979,11 +914,9 @@
           <w:numId w:val="5"/>
         </w:numPr>
       </w:pPr>
-      <w:proofErr w:type="spellStart"/>
       <w:r>
         <w:t>WebsiteTraffic</w:t>
       </w:r>
-      <w:proofErr w:type="spellEnd"/>
     </w:p>
     <w:p>
       <w:pPr>
@@ -992,11 +925,9 @@
           <w:numId w:val="5"/>
         </w:numPr>
       </w:pPr>
-      <w:proofErr w:type="spellStart"/>
       <w:r>
         <w:t>StatsReport</w:t>
       </w:r>
-      <w:proofErr w:type="spellEnd"/>
     </w:p>
     <w:p>
       <w:r>
@@ -1005,15 +936,7 @@
     </w:p>
     <w:p>
       <w:r>
-        <w:t xml:space="preserve">An important observation is that most features are already </w:t>
-      </w:r>
-      <w:proofErr w:type="spellStart"/>
-      <w:r>
-        <w:t>preprocessed</w:t>
-      </w:r>
-      <w:proofErr w:type="spellEnd"/>
-      <w:r>
-        <w:t xml:space="preserve"> and transformed into security indicators rather than raw website attributes. Therefore, this project focuses primarily on classification rather than feature extraction.</w:t>
+        <w:t>An important observation is that most features are already preprocessed and transformed into security indicators rather than raw website attributes. Therefore, this project focuses primarily on classification rather than feature extraction.</w:t>
       </w:r>
     </w:p>
     <w:p>
@@ -1409,11 +1332,9 @@
             <w:hideMark/>
           </w:tcPr>
           <w:p>
-            <w:proofErr w:type="spellStart"/>
             <w:r>
               <w:t>AnchorURL</w:t>
             </w:r>
-            <w:proofErr w:type="spellEnd"/>
           </w:p>
         </w:tc>
         <w:tc>
@@ -1443,13 +1364,8 @@
             <w:hideMark/>
           </w:tcPr>
           <w:p>
-            <w:proofErr w:type="spellStart"/>
             <w:r>
-              <w:t>PrefixSuffix</w:t>
-            </w:r>
-            <w:proofErr w:type="spellEnd"/>
-            <w:r>
-              <w:t>-</w:t>
+              <w:t>PrefixSuffix-</w:t>
             </w:r>
           </w:p>
         </w:tc>
@@ -1480,11 +1396,9 @@
             <w:hideMark/>
           </w:tcPr>
           <w:p>
-            <w:proofErr w:type="spellStart"/>
             <w:r>
               <w:t>SubDomains</w:t>
             </w:r>
-            <w:proofErr w:type="spellEnd"/>
           </w:p>
         </w:tc>
         <w:tc>
@@ -1517,11 +1431,9 @@
             <w:hideMark/>
           </w:tcPr>
           <w:p>
-            <w:proofErr w:type="spellStart"/>
             <w:r>
               <w:t>WebsiteTraffic</w:t>
             </w:r>
-            <w:proofErr w:type="spellEnd"/>
           </w:p>
         </w:tc>
         <w:tc>
@@ -1551,11 +1463,41 @@
             <w:hideMark/>
           </w:tcPr>
           <w:p>
-            <w:proofErr w:type="spellStart"/>
+            <w:r>
+              <w:t>LinksInScriptTags</w:t>
+            </w:r>
+          </w:p>
+        </w:tc>
+        <w:tc>
+          <w:tcPr>
+            <w:tcW w:w="0" w:type="auto"/>
+            <w:vAlign w:val="center"/>
+            <w:hideMark/>
+          </w:tcPr>
+          <w:p>
+            <w:r>
+              <w:t>0.2</w:t>
+            </w:r>
+            <w:r>
+              <w:t>44</w:t>
+            </w:r>
+          </w:p>
+        </w:tc>
+      </w:tr>
+      <w:tr>
+        <w:trPr>
+          <w:tblCellSpacing w:w="15" w:type="dxa"/>
+        </w:trPr>
+        <w:tc>
+          <w:tcPr>
+            <w:tcW w:w="0" w:type="auto"/>
+            <w:vAlign w:val="center"/>
+            <w:hideMark/>
+          </w:tcPr>
+          <w:p>
             <w:r>
               <w:t>RequestURL</w:t>
             </w:r>
-            <w:proofErr w:type="spellEnd"/>
           </w:p>
         </w:tc>
         <w:tc>
@@ -1574,76 +1516,23 @@
           </w:p>
         </w:tc>
       </w:tr>
-      <w:tr>
-        <w:trPr>
-          <w:tblCellSpacing w:w="15" w:type="dxa"/>
-        </w:trPr>
-        <w:tc>
-          <w:tcPr>
-            <w:tcW w:w="0" w:type="auto"/>
-            <w:vAlign w:val="center"/>
-            <w:hideMark/>
-          </w:tcPr>
-          <w:p>
-            <w:proofErr w:type="spellStart"/>
-            <w:r>
-              <w:t>LinksInScriptTags</w:t>
-            </w:r>
-            <w:proofErr w:type="spellEnd"/>
-          </w:p>
-        </w:tc>
-        <w:tc>
-          <w:tcPr>
-            <w:tcW w:w="0" w:type="auto"/>
-            <w:vAlign w:val="center"/>
-            <w:hideMark/>
-          </w:tcPr>
-          <w:p>
-            <w:r>
-              <w:t>0.2</w:t>
-            </w:r>
-            <w:r>
-              <w:t>44</w:t>
-            </w:r>
-          </w:p>
-        </w:tc>
-      </w:tr>
     </w:tbl>
     <w:p>
       <w:r>
-        <w:t xml:space="preserve">The results support the author's conclusion that HTTPS, </w:t>
-      </w:r>
-      <w:proofErr w:type="spellStart"/>
-      <w:r>
-        <w:t>AnchorURL</w:t>
-      </w:r>
-      <w:proofErr w:type="spellEnd"/>
-      <w:r>
-        <w:t xml:space="preserve">, and </w:t>
-      </w:r>
-      <w:proofErr w:type="spellStart"/>
-      <w:r>
-        <w:t>WebsiteTraffic</w:t>
-      </w:r>
-      <w:proofErr w:type="spellEnd"/>
-      <w:r>
-        <w:t xml:space="preserve"> are among the most influential features for phishing detection.</w:t>
-      </w:r>
-    </w:p>
-    <w:p>
+        <w:t>The results support the author's conclusion that HTTPS, AnchorURL, and WebsiteTraffic are among the most influential features for phishing detection.</w:t>
+      </w:r>
+    </w:p>
+    <w:p>
+      <w:proofErr w:type="gramStart"/>
       <w:r>
         <w:t xml:space="preserve">In particular, </w:t>
       </w:r>
       <w:r>
-        <w:t xml:space="preserve">HTTPS and </w:t>
-      </w:r>
-      <w:proofErr w:type="spellStart"/>
-      <w:r>
-        <w:t>AnchorURL</w:t>
-      </w:r>
-      <w:proofErr w:type="spellEnd"/>
-      <w:r>
-        <w:t xml:space="preserve"> exhibit substantially stronger relationships with the target variable than any other feature in the dataset.</w:t>
+        <w:t>HTTPS</w:t>
+      </w:r>
+      <w:proofErr w:type="gramEnd"/>
+      <w:r>
+        <w:t xml:space="preserve"> and AnchorURL exhibit substantially stronger relationships with the target variable than any other feature in the dataset.</w:t>
       </w:r>
       <w:r>
         <w:t xml:space="preserve"> This suggests that the security characteristics captured by these variables play a significant role in distinguishing phishing websites from legitimate ones.</w:t>
@@ -1651,23 +1540,7 @@
     </w:p>
     <w:p>
       <w:r>
-        <w:t xml:space="preserve">In addition to correlation analysis, crosstab analysis was performed for several highly influential features, including HTTPS, </w:t>
-      </w:r>
-      <w:proofErr w:type="spellStart"/>
-      <w:r>
-        <w:t>AnchorURL</w:t>
-      </w:r>
-      <w:proofErr w:type="spellEnd"/>
-      <w:r>
-        <w:t xml:space="preserve">, and </w:t>
-      </w:r>
-      <w:proofErr w:type="spellStart"/>
-      <w:r>
-        <w:t>WebsiteTraffic</w:t>
-      </w:r>
-      <w:proofErr w:type="spellEnd"/>
-      <w:r>
-        <w:t>. The results showed clear differences in feature distributions between phishing and legitimate websites. This finding supports the correlation analysis and provides additional evidence that these features contribute meaningful information for phishing detection.</w:t>
+        <w:t>In addition to correlation analysis, crosstab analysis was performed for several highly influential features, including HTTPS, AnchorURL, and WebsiteTraffic. The results showed clear differences in feature distributions between phishing and legitimate websites. This finding supports the correlation analysis and provides additional evidence that these features contribute meaningful information for phishing detection.</w:t>
       </w:r>
       <w:r>
         <w:br/>
@@ -1741,7 +1614,6 @@
       <w:r>
         <w:t xml:space="preserve">For example, the removed feature </w:t>
       </w:r>
-      <w:proofErr w:type="spellStart"/>
       <w:r>
         <w:rPr>
           <w:i/>
@@ -1749,7 +1621,6 @@
         </w:rPr>
         <w:t>DomainRegLen</w:t>
       </w:r>
-      <w:proofErr w:type="spellEnd"/>
       <w:r>
         <w:t xml:space="preserve"> exhibited a correlation magnitude of approximately 0.226 with the target variable, which exceeds the correlation values of several features that were retained.</w:t>
       </w:r>
@@ -1800,15 +1671,7 @@
     </w:p>
     <w:p>
       <w:r>
-        <w:t xml:space="preserve">Feature engineering plays an important role in machine learning because it transforms raw data into representations that can improve model performance. In cybersecurity applications, feature engineering is particularly important because malicious </w:t>
-      </w:r>
-      <w:proofErr w:type="spellStart"/>
-      <w:r>
-        <w:t>behavior</w:t>
-      </w:r>
-      <w:proofErr w:type="spellEnd"/>
-      <w:r>
-        <w:t xml:space="preserve"> is often identified through patterns embedded within network traffic, URLs, or system activity rather than through a single indicator.</w:t>
+        <w:t>Feature engineering plays an important role in machine learning because it transforms raw data into representations that can improve model performance. In cybersecurity applications, feature engineering is particularly important because malicious behavior is often identified through patterns embedded within network traffic, URLs, or system activity rather than through a single indicator.</w:t>
       </w:r>
     </w:p>
     <w:p>
@@ -1849,13 +1712,8 @@
           <w:numId w:val="38"/>
         </w:numPr>
       </w:pPr>
-      <w:proofErr w:type="spellStart"/>
-      <w:r>
-        <w:t>LongURL</w:t>
-      </w:r>
-      <w:proofErr w:type="spellEnd"/>
-      <w:r>
-        <w:t xml:space="preserve"> </w:t>
+      <w:r>
+        <w:t xml:space="preserve">LongURL </w:t>
       </w:r>
     </w:p>
     <w:p>
@@ -1898,13 +1756,8 @@
           <w:numId w:val="38"/>
         </w:numPr>
       </w:pPr>
-      <w:proofErr w:type="spellStart"/>
-      <w:r>
-        <w:t>DomainRegLen</w:t>
-      </w:r>
-      <w:proofErr w:type="spellEnd"/>
-      <w:r>
-        <w:t xml:space="preserve"> </w:t>
+      <w:r>
+        <w:t xml:space="preserve">DomainRegLen </w:t>
       </w:r>
     </w:p>
     <w:p>
@@ -1925,13 +1778,8 @@
           <w:numId w:val="38"/>
         </w:numPr>
       </w:pPr>
-      <w:proofErr w:type="spellStart"/>
-      <w:r>
-        <w:t>UsingPopupWindow</w:t>
-      </w:r>
-      <w:proofErr w:type="spellEnd"/>
-      <w:r>
-        <w:t xml:space="preserve"> </w:t>
+      <w:r>
+        <w:t xml:space="preserve">UsingPopupWindow </w:t>
       </w:r>
     </w:p>
     <w:p>
@@ -1941,13 +1789,8 @@
           <w:numId w:val="38"/>
         </w:numPr>
       </w:pPr>
-      <w:proofErr w:type="spellStart"/>
-      <w:r>
-        <w:t>IframeRedirection</w:t>
-      </w:r>
-      <w:proofErr w:type="spellEnd"/>
-      <w:r>
-        <w:t xml:space="preserve"> </w:t>
+      <w:r>
+        <w:t xml:space="preserve">IframeRedirection </w:t>
       </w:r>
     </w:p>
     <w:p>
@@ -1957,13 +1800,8 @@
           <w:numId w:val="38"/>
         </w:numPr>
       </w:pPr>
-      <w:proofErr w:type="spellStart"/>
-      <w:r>
-        <w:t>LinksPointingToPage</w:t>
-      </w:r>
-      <w:proofErr w:type="spellEnd"/>
-      <w:r>
-        <w:t xml:space="preserve"> </w:t>
+      <w:r>
+        <w:t xml:space="preserve">LinksPointingToPage </w:t>
       </w:r>
     </w:p>
     <w:p>
@@ -1978,36 +1816,12 @@
     </w:p>
     <w:p>
       <w:r>
-        <w:t xml:space="preserve">For example, </w:t>
-      </w:r>
-      <w:proofErr w:type="spellStart"/>
-      <w:r>
-        <w:t>DomainRegLen</w:t>
-      </w:r>
-      <w:proofErr w:type="spellEnd"/>
-      <w:r>
-        <w:t xml:space="preserve"> exhibited a correlation magnitude of approximately 0.226 with the target variable, which exceeded the correlation values of several retained features. This suggests that potentially useful information may have been discarded.</w:t>
-      </w:r>
-    </w:p>
-    <w:p>
-      <w:r>
-        <w:t xml:space="preserve">Although the feature-selection process reduced the number of variables and resulted in strong classification performance, the notebook provides limited evidence that all removed features were unnecessary. In addition to correlation analysis, feature importance scores from the Gradient Boosting model were examined. The feature importance analysis identified HTTPS, </w:t>
-      </w:r>
-      <w:proofErr w:type="spellStart"/>
-      <w:r>
-        <w:t>AnchorURL</w:t>
-      </w:r>
-      <w:proofErr w:type="spellEnd"/>
-      <w:r>
-        <w:t xml:space="preserve">, and </w:t>
-      </w:r>
-      <w:proofErr w:type="spellStart"/>
-      <w:r>
-        <w:t>WebsiteTraffic</w:t>
-      </w:r>
-      <w:proofErr w:type="spellEnd"/>
-      <w:r>
-        <w:t xml:space="preserve"> among the most influential predictors. This result is consistent with the correlation and crosstab analyses, providing additional evidence that these features contribute substantially to phishing website detection performance. However, the feature importance results do not fully validate the removal of all discarded features, and a more systematic feature-selection methodology would provide stronger justification for these decisions.</w:t>
+        <w:t>For example, DomainRegLen exhibited a correlation magnitude of approximately 0.226 with the target variable, which exceeded the correlation values of several retained features. This suggests that potentially useful information may have been discarded.</w:t>
+      </w:r>
+    </w:p>
+    <w:p>
+      <w:r>
+        <w:t>Although the feature-selection process reduced the number of variables and resulted in strong classification performance, the notebook provides limited evidence that all removed features were unnecessary. In addition to correlation analysis, feature importance scores from the Gradient Boosting model were examined. The feature importance analysis identified HTTPS, AnchorURL, and WebsiteTraffic among the most influential predictors. This result is consistent with the correlation and crosstab analyses, providing additional evidence that these features contribute substantially to phishing website detection performance. However, the feature importance results do not fully validate the removal of all discarded features, and a more systematic feature-selection methodology would provide stronger justification for these decisions.</w:t>
       </w:r>
     </w:p>
     <w:p>
@@ -2043,15 +1857,7 @@
         </w:numPr>
       </w:pPr>
       <w:r>
-        <w:t xml:space="preserve">K-Nearest </w:t>
-      </w:r>
-      <w:proofErr w:type="spellStart"/>
-      <w:r>
-        <w:t>Neighbors</w:t>
-      </w:r>
-      <w:proofErr w:type="spellEnd"/>
-      <w:r>
-        <w:t xml:space="preserve"> (KNN) </w:t>
+        <w:t xml:space="preserve">K-Nearest Neighbors (KNN) </w:t>
       </w:r>
     </w:p>
     <w:p>
@@ -2073,15 +1879,7 @@
         </w:numPr>
       </w:pPr>
       <w:r>
-        <w:t xml:space="preserve">Multi-Layer </w:t>
-      </w:r>
-      <w:proofErr w:type="spellStart"/>
-      <w:r>
-        <w:t>Perceptrons</w:t>
-      </w:r>
-      <w:proofErr w:type="spellEnd"/>
-      <w:r>
-        <w:t xml:space="preserve"> (MLP) </w:t>
+        <w:t xml:space="preserve">Multi-Layer Perceptrons (MLP) </w:t>
       </w:r>
     </w:p>
     <w:p>
@@ -2211,7 +2009,15 @@
     </w:p>
     <w:p>
       <w:r>
-        <w:t>The notebook performs several preprocessing operations intended to identify and handle outliers, including:</w:t>
+        <w:t xml:space="preserve">The notebook performs several preprocessing operations </w:t>
+      </w:r>
+      <w:proofErr w:type="gramStart"/>
+      <w:r>
+        <w:t>intended</w:t>
+      </w:r>
+      <w:proofErr w:type="gramEnd"/>
+      <w:r>
+        <w:t xml:space="preserve"> to identify and handle outliers, including:</w:t>
       </w:r>
     </w:p>
     <w:p>
@@ -2428,21 +2234,24 @@
       </w:r>
     </w:p>
     <w:p>
-      <w:proofErr w:type="spellStart"/>
-      <w:r>
-        <w:t>df</w:t>
-      </w:r>
-      <w:proofErr w:type="spellEnd"/>
-      <w:r>
-        <w:t xml:space="preserve"> = </w:t>
-      </w:r>
-      <w:proofErr w:type="spellStart"/>
-      <w:r>
-        <w:t>pd.read_csv</w:t>
-      </w:r>
-      <w:proofErr w:type="spellEnd"/>
-      <w:r>
-        <w:t>("C:\\Users\\SUMANJALI\\URL-Based Phishing Detection Using Machine Learning\\phishing.csv")</w:t>
+      <w:r>
+        <w:t xml:space="preserve">df = </w:t>
+      </w:r>
+      <w:proofErr w:type="gramStart"/>
+      <w:r>
+        <w:t>pd.read</w:t>
+      </w:r>
+      <w:proofErr w:type="gramEnd"/>
+      <w:r>
+        <w:t>_</w:t>
+      </w:r>
+      <w:proofErr w:type="gramStart"/>
+      <w:r>
+        <w:t>csv(</w:t>
+      </w:r>
+      <w:proofErr w:type="gramEnd"/>
+      <w:r>
+        <w:t>"C:\\Users\\SUMANJALI\\URL-Based Phishing Detection Using Machine Learning\\phishing.csv")</w:t>
       </w:r>
     </w:p>
     <w:p>
@@ -2456,21 +2265,16 @@
       </w:r>
     </w:p>
     <w:p>
-      <w:proofErr w:type="spellStart"/>
-      <w:r>
-        <w:t>df</w:t>
-      </w:r>
-      <w:proofErr w:type="spellEnd"/>
-      <w:r>
-        <w:t xml:space="preserve"> = </w:t>
-      </w:r>
-      <w:proofErr w:type="spellStart"/>
-      <w:r>
-        <w:t>pd.read_csv</w:t>
-      </w:r>
-      <w:proofErr w:type="spellEnd"/>
-      <w:r>
-        <w:t>("phishing.csv")</w:t>
+      <w:r>
+        <w:t xml:space="preserve">df = </w:t>
+      </w:r>
+      <w:proofErr w:type="gramStart"/>
+      <w:r>
+        <w:t>pd.read</w:t>
+      </w:r>
+      <w:proofErr w:type="gramEnd"/>
+      <w:r>
+        <w:t>_csv("phishing.csv")</w:t>
       </w:r>
     </w:p>
     <w:p>
@@ -2479,21 +2283,16 @@
       </w:r>
     </w:p>
     <w:p>
-      <w:proofErr w:type="spellStart"/>
-      <w:r>
-        <w:t>df</w:t>
-      </w:r>
-      <w:proofErr w:type="spellEnd"/>
-      <w:r>
-        <w:t xml:space="preserve"> = </w:t>
-      </w:r>
-      <w:proofErr w:type="spellStart"/>
-      <w:r>
-        <w:t>pd.read_csv</w:t>
-      </w:r>
-      <w:proofErr w:type="spellEnd"/>
-      <w:r>
-        <w:t>("./data/phishing.csv")</w:t>
+      <w:r>
+        <w:t xml:space="preserve">df = </w:t>
+      </w:r>
+      <w:proofErr w:type="gramStart"/>
+      <w:r>
+        <w:t>pd.read</w:t>
+      </w:r>
+      <w:proofErr w:type="gramEnd"/>
+      <w:r>
+        <w:t>_csv("./data/phishing.csv")</w:t>
       </w:r>
     </w:p>
     <w:p>
@@ -2761,6 +2560,11 @@
     </w:p>
     <w:p>
       <w:r>
+        <w:t>In addition, the notebook applies feature scaling before the train-test split. This introduces data leakage because information from the test set influences the scaling parameters used during training. Although the impact may be limited in this dataset, the resulting performance estimates may be slightly optimistic compared with a fully isolated evaluation procedure.</w:t>
+      </w:r>
+    </w:p>
+    <w:p>
+      <w:r>
         <w:t>Consequently, stronger justification should have been provided for some preprocessing choices, particularly outlier handling and oversampling.</w:t>
       </w:r>
     </w:p>
@@ -2810,28 +2614,12 @@
     </w:p>
     <w:p>
       <w:r>
-        <w:t xml:space="preserve">Several machine learning algorithms used in the notebook contain stochastic components, including Decision Trees, Random Forests, and Multi-Layer </w:t>
-      </w:r>
-      <w:proofErr w:type="spellStart"/>
-      <w:r>
-        <w:t>Perceptrons</w:t>
-      </w:r>
-      <w:proofErr w:type="spellEnd"/>
-      <w:r>
-        <w:t>.</w:t>
-      </w:r>
-    </w:p>
-    <w:p>
-      <w:r>
-        <w:t xml:space="preserve">However, the notebook does not consistently specify a </w:t>
-      </w:r>
-      <w:proofErr w:type="spellStart"/>
-      <w:r>
-        <w:t>random_state</w:t>
-      </w:r>
-      <w:proofErr w:type="spellEnd"/>
-      <w:r>
-        <w:t xml:space="preserve"> parameter when initializing these models.</w:t>
+        <w:t>Several machine learning algorithms used in the notebook contain stochastic components, including Decision Trees, Random Forests, and Multi-Layer Perceptrons.</w:t>
+      </w:r>
+    </w:p>
+    <w:p>
+      <w:r>
+        <w:t>However, the notebook does not consistently specify a random_state parameter when initializing these models.</w:t>
       </w:r>
     </w:p>
     <w:p>
@@ -3106,13 +2894,8 @@
       </w:r>
     </w:p>
     <w:p>
-      <w:proofErr w:type="spellStart"/>
-      <w:r>
-        <w:t>random_state</w:t>
-      </w:r>
-      <w:proofErr w:type="spellEnd"/>
-      <w:r>
-        <w:t xml:space="preserve"> = 42</w:t>
+      <w:r>
+        <w:t>random_state = 42</w:t>
       </w:r>
     </w:p>
     <w:p>
@@ -3261,7 +3044,15 @@
         <w:t xml:space="preserve">Overall, </w:t>
       </w:r>
       <w:r>
-        <w:t>the project can be reproduced successfully and the author's primary findings were verified. However, additional documentation, stronger reproducibility practices, and clearer methodological justification would significantly improve transparency, reliability, and ease of reproduction.</w:t>
+        <w:t xml:space="preserve">the project can be reproduced </w:t>
+      </w:r>
+      <w:proofErr w:type="gramStart"/>
+      <w:r>
+        <w:t>successfully</w:t>
+      </w:r>
+      <w:proofErr w:type="gramEnd"/>
+      <w:r>
+        <w:t xml:space="preserve"> and the author's primary findings were verified. However, additional documentation, stronger reproducibility practices, and clearer methodological justification would significantly improve transparency, reliability, and ease of reproduction.</w:t>
       </w:r>
     </w:p>
     <w:p/>
@@ -3316,7 +3107,15 @@
     </w:p>
     <w:p>
       <w:r>
-        <w:t>SMOTE is a commonly used technique that generates synthetic examples of minority-class observations in order to create a more balanced training dataset.</w:t>
+        <w:t xml:space="preserve">SMOTE is a commonly used technique that generates synthetic examples of minority-class observations </w:t>
+      </w:r>
+      <w:proofErr w:type="gramStart"/>
+      <w:r>
+        <w:t>in order to</w:t>
+      </w:r>
+      <w:proofErr w:type="gramEnd"/>
+      <w:r>
+        <w:t xml:space="preserve"> create a more balanced training dataset.</w:t>
       </w:r>
     </w:p>
     <w:p>
@@ -3535,7 +3334,15 @@
     </w:p>
     <w:p>
       <w:r>
-        <w:t>This comparison would allow researchers to determine whether oversampling actually improves performance or simply increases model complexity.</w:t>
+        <w:t xml:space="preserve">This comparison would allow researchers to determine whether oversampling </w:t>
+      </w:r>
+      <w:proofErr w:type="gramStart"/>
+      <w:r>
+        <w:t>actually improves</w:t>
+      </w:r>
+      <w:proofErr w:type="gramEnd"/>
+      <w:r>
+        <w:t xml:space="preserve"> performance or simply increases model complexity.</w:t>
       </w:r>
     </w:p>
     <w:p>
@@ -3698,8 +3505,13 @@
       </w:r>
     </w:p>
     <w:p>
-      <w:r>
-        <w:t xml:space="preserve">This raises concerns regarding whether the outlier-removal process contributed meaningful improvements to the model </w:t>
+      <w:proofErr w:type="gramStart"/>
+      <w:r>
+        <w:t>This raises</w:t>
+      </w:r>
+      <w:proofErr w:type="gramEnd"/>
+      <w:r>
+        <w:t xml:space="preserve"> concerns regarding whether the outlier-removal process contributed meaningful improvements to the model </w:t>
       </w:r>
       <w:r>
         <w:t>performance or simply increased preprocessing complexity.</w:t>
@@ -3790,21 +3602,12 @@
       <w:r>
         <w:t xml:space="preserve">For example, the feature </w:t>
       </w:r>
-      <w:proofErr w:type="spellStart"/>
       <w:r>
         <w:rPr>
           <w:i/>
           <w:iCs/>
         </w:rPr>
-        <w:t>DomainRegLen</w:t>
-      </w:r>
-      <w:proofErr w:type="spellEnd"/>
-      <w:r>
-        <w:rPr>
-          <w:i/>
-          <w:iCs/>
-        </w:rPr>
-        <w:t xml:space="preserve"> </w:t>
+        <w:t xml:space="preserve">DomainRegLen </w:t>
       </w:r>
       <w:r>
         <w:t>demonstrated a stronger relationship with the target variable than several features that were retained.</w:t>
@@ -4002,7 +3805,15 @@
         <w:t xml:space="preserve">A comprehensive evaluation should </w:t>
       </w:r>
       <w:r>
-        <w:t>consider all of these metrics rather than focusing mainly on overall accuracy.</w:t>
+        <w:t xml:space="preserve">consider </w:t>
+      </w:r>
+      <w:proofErr w:type="gramStart"/>
+      <w:r>
+        <w:t>all of</w:t>
+      </w:r>
+      <w:proofErr w:type="gramEnd"/>
+      <w:r>
+        <w:t xml:space="preserve"> these metrics rather than focusing mainly on overall accuracy.</w:t>
       </w:r>
     </w:p>
     <w:p/>
@@ -4093,11 +3904,9 @@
           <w:numId w:val="26"/>
         </w:numPr>
       </w:pPr>
-      <w:proofErr w:type="spellStart"/>
       <w:r>
         <w:t>AnchorURL</w:t>
       </w:r>
-      <w:proofErr w:type="spellEnd"/>
     </w:p>
     <w:p>
       <w:pPr>
@@ -4106,11 +3915,9 @@
           <w:numId w:val="26"/>
         </w:numPr>
       </w:pPr>
-      <w:proofErr w:type="spellStart"/>
       <w:r>
         <w:t>WebsiteTraffic</w:t>
       </w:r>
-      <w:proofErr w:type="spellEnd"/>
     </w:p>
     <w:p>
       <w:r>
@@ -4197,7 +4004,15 @@
         <w:t xml:space="preserve">Consequently, </w:t>
       </w:r>
       <w:r>
-        <w:t>while the final results appear reasonable and the primary conclusion is supported, certain aspects of the methodology could be strengthened to provide greater confidence in the reported findings.</w:t>
+        <w:t xml:space="preserve">while the </w:t>
+      </w:r>
+      <w:proofErr w:type="gramStart"/>
+      <w:r>
+        <w:t>final results</w:t>
+      </w:r>
+      <w:proofErr w:type="gramEnd"/>
+      <w:r>
+        <w:t xml:space="preserve"> appear reasonable and the primary conclusion is supported, certain aspects of the methodology could be strengthened to provide greater confidence in the reported findings.</w:t>
       </w:r>
     </w:p>
     <w:p/>
@@ -4269,15 +4084,7 @@
         </w:numPr>
       </w:pPr>
       <w:r>
-        <w:t xml:space="preserve">K-Nearest </w:t>
-      </w:r>
-      <w:proofErr w:type="spellStart"/>
-      <w:r>
-        <w:t>Neighbors</w:t>
-      </w:r>
-      <w:proofErr w:type="spellEnd"/>
-      <w:r>
-        <w:t xml:space="preserve"> (KNN)</w:t>
+        <w:t>K-Nearest Neighbors (KNN)</w:t>
       </w:r>
     </w:p>
     <w:p>
@@ -4827,13 +4634,8 @@
               <w:t xml:space="preserve">   </w:t>
             </w:r>
             <w:r>
-              <w:t xml:space="preserve">K-Nearest </w:t>
+              <w:t>K-Nearest Neighbors</w:t>
             </w:r>
-            <w:proofErr w:type="spellStart"/>
-            <w:r>
-              <w:t>Neighbors</w:t>
-            </w:r>
-            <w:proofErr w:type="spellEnd"/>
           </w:p>
         </w:tc>
         <w:tc>
@@ -4951,15 +4753,7 @@
         <w:t xml:space="preserve">The results </w:t>
       </w:r>
       <w:r>
-        <w:t xml:space="preserve">indicate that ensemble-based methods achieved the strongest performance on this dataset. Gradient Boosting and Random Forest occupied the top two positions, while simpler models such as Logistic Regression and K-Nearest </w:t>
-      </w:r>
-      <w:proofErr w:type="spellStart"/>
-      <w:r>
-        <w:t>Neighbors</w:t>
-      </w:r>
-      <w:proofErr w:type="spellEnd"/>
-      <w:r>
-        <w:t xml:space="preserve"> achieved slightly lower accuracy. Naive Bayes performed substantially worse than all other evaluated models.</w:t>
+        <w:t>indicate that ensemble-based methods achieved the strongest performance on this dataset. Gradient Boosting and Random Forest occupied the top two positions, while simpler models such as Logistic Regression and K-Nearest Neighbors achieved slightly lower accuracy. Naive Bayes performed substantially worse than all other evaluated models.</w:t>
       </w:r>
     </w:p>
     <w:p>
@@ -5050,7 +4844,15 @@
     </w:p>
     <w:p>
       <w:r>
-        <w:t>From a cybersecurity perspective, this performance indicates that the model is capable of detecting most phishing websites while maintaining a relatively low rate of false alarms for legitimate websites.</w:t>
+        <w:t xml:space="preserve">From a cybersecurity perspective, this performance indicates that the model </w:t>
+      </w:r>
+      <w:proofErr w:type="gramStart"/>
+      <w:r>
+        <w:t>is capable of detecting</w:t>
+      </w:r>
+      <w:proofErr w:type="gramEnd"/>
+      <w:r>
+        <w:t xml:space="preserve"> most phishing websites while maintaining a relatively low rate of false alarms for legitimate websites.</w:t>
       </w:r>
     </w:p>
     <w:p>
@@ -5122,15 +4924,7 @@
         <w:t>correctly classified all observations belonging to Class -1, it correctly identified only a small proportion of Class 1 observations.</w:t>
       </w:r>
       <w:r>
-        <w:t xml:space="preserve"> This resulted in a highly unbalanced classifier that </w:t>
-      </w:r>
-      <w:proofErr w:type="spellStart"/>
-      <w:r>
-        <w:t>favored</w:t>
-      </w:r>
-      <w:proofErr w:type="spellEnd"/>
-      <w:r>
-        <w:t xml:space="preserve"> one class while performing poorly on the other. The results illustrate why accuracy alone can be misleading and highlight the importance of examining precision, recall, and F1-scores alongside overall accuracy.</w:t>
+        <w:t xml:space="preserve"> This resulted in a highly unbalanced classifier that favored one class while performing poorly on the other. The results illustrate why accuracy alone can be misleading and highlight the importance of examining precision, recall, and F1-scores alongside overall accuracy.</w:t>
       </w:r>
     </w:p>
     <w:p>
@@ -5231,7 +5025,15 @@
         <w:t>Precision</w:t>
       </w:r>
       <w:r>
-        <w:t xml:space="preserve"> measures the proportion of websites predicted as phishing that were actually phishing:</w:t>
+        <w:t xml:space="preserve"> measures the proportion of websites predicted as phishing that were </w:t>
+      </w:r>
+      <w:proofErr w:type="gramStart"/>
+      <w:r>
+        <w:t>actually phishing</w:t>
+      </w:r>
+      <w:proofErr w:type="gramEnd"/>
+      <w:r>
+        <w:t>:</w:t>
       </w:r>
     </w:p>
     <w:p>
@@ -5302,7 +5104,39 @@
     </w:p>
     <w:p>
       <w:r>
-        <w:t>MCC = (TP × TN − FP × FN) / √[(TP + FP)(TP + FN)(TN + FP)(TN + FN)]</w:t>
+        <w:t xml:space="preserve">MCC = (TP × TN − FP × FN) / </w:t>
+      </w:r>
+      <w:proofErr w:type="gramStart"/>
+      <w:r>
+        <w:t>√[</w:t>
+      </w:r>
+      <w:proofErr w:type="gramEnd"/>
+      <w:r>
+        <w:t xml:space="preserve">(TP + </w:t>
+      </w:r>
+      <w:proofErr w:type="gramStart"/>
+      <w:r>
+        <w:t>FP)(</w:t>
+      </w:r>
+      <w:proofErr w:type="gramEnd"/>
+      <w:r>
+        <w:t xml:space="preserve">TP + </w:t>
+      </w:r>
+      <w:proofErr w:type="gramStart"/>
+      <w:r>
+        <w:t>FN)(</w:t>
+      </w:r>
+      <w:proofErr w:type="gramEnd"/>
+      <w:r>
+        <w:t xml:space="preserve">TN + </w:t>
+      </w:r>
+      <w:proofErr w:type="gramStart"/>
+      <w:r>
+        <w:t>FP)(</w:t>
+      </w:r>
+      <w:proofErr w:type="gramEnd"/>
+      <w:r>
+        <w:t>TN + FN)]</w:t>
       </w:r>
     </w:p>
     <w:p>
@@ -5475,15 +5309,7 @@
         <w:t>4</w:t>
       </w:r>
       <w:r>
-        <w:t xml:space="preserve"> false positives and 29 false negatives. The relatively balanced distribution of errors suggests that the classifier did not strongly </w:t>
-      </w:r>
-      <w:proofErr w:type="spellStart"/>
-      <w:r>
-        <w:t>favor</w:t>
-      </w:r>
-      <w:proofErr w:type="spellEnd"/>
-      <w:r>
-        <w:t xml:space="preserve"> one class over the other.</w:t>
+        <w:t xml:space="preserve"> false positives and 29 false negatives. The relatively balanced distribution of errors suggests that the classifier did not strongly favor one class over the other.</w:t>
       </w:r>
     </w:p>
     <w:p>
@@ -5549,34 +5375,18 @@
     </w:p>
     <w:p>
       <w:r>
-        <w:t xml:space="preserve">Several strengths were identified throughout the analysis. The project uses a publicly available dataset, evaluates multiple machine learning algorithms, performs exploratory data analysis, and reports several performance metrics. The final conclusion that Gradient Boosting achieved the highest performance was supported by the reproduced results. Furthermore, </w:t>
-      </w:r>
-      <w:r>
-        <w:t xml:space="preserve">the independent analysis confirmed that important features identified by the author, such as HTTPS, </w:t>
-      </w:r>
-      <w:proofErr w:type="spellStart"/>
-      <w:r>
-        <w:t>AnchorURL</w:t>
-      </w:r>
-      <w:proofErr w:type="spellEnd"/>
-      <w:r>
-        <w:t xml:space="preserve">, and </w:t>
-      </w:r>
-      <w:proofErr w:type="spellStart"/>
-      <w:r>
-        <w:t>WebsiteTraffic</w:t>
-      </w:r>
-      <w:proofErr w:type="spellEnd"/>
-      <w:r>
-        <w:t xml:space="preserve">, are among the strongest predictors in the dataset, with HTTPS and </w:t>
-      </w:r>
-      <w:proofErr w:type="spellStart"/>
-      <w:r>
-        <w:t>AnchorURL</w:t>
-      </w:r>
-      <w:proofErr w:type="spellEnd"/>
-      <w:r>
-        <w:t xml:space="preserve"> exhibiting particularly strong correlations with the target variable.</w:t>
+        <w:t xml:space="preserve">Several strengths were identified throughout the analysis. The project uses a publicly available dataset, evaluates multiple machine learning algorithms, performs exploratory data analysis, and reports several performance metrics. </w:t>
+      </w:r>
+      <w:proofErr w:type="gramStart"/>
+      <w:r>
+        <w:t>The final conclusion</w:t>
+      </w:r>
+      <w:proofErr w:type="gramEnd"/>
+      <w:r>
+        <w:t xml:space="preserve"> that Gradient Boosting achieved the highest performance was supported by the reproduced results. Furthermore, </w:t>
+      </w:r>
+      <w:r>
+        <w:t>the independent analysis confirmed that important features identified by the author, such as HTTPS, AnchorURL, and WebsiteTraffic, are among the strongest predictors in the dataset, with HTTPS and AnchorURL exhibiting particularly strong correlations with the target variable.</w:t>
       </w:r>
     </w:p>
     <w:p>

</xml_diff>